<commit_message>
feat: update monitoring configs and activity 2 documentation
- Fix prometheus scrape targets to use dns names

- Update docker-compose network and container settings

- Add activity 2 documentation and binaries

- Add initial activity 3 files
</commit_message>
<xml_diff>
--- a/act2/ass2.docx
+++ b/act2/ass2.docx
@@ -1,9 +1,12 @@
 
 <file path=word/document.xml><?xml version="1.0" encoding="utf-8"?>
-<w:document xmlns:wpc="http://schemas.microsoft.com/office/word/2010/wordprocessingCanvas" xmlns:cx="http://schemas.microsoft.com/office/drawing/2014/chartex" xmlns:cx1="http://schemas.microsoft.com/office/drawing/2015/9/8/chartex" xmlns:cx2="http://schemas.microsoft.com/office/drawing/2015/10/21/chartex" xmlns:cx3="http://schemas.microsoft.com/office/drawing/2016/5/9/chartex" xmlns:cx4="http://schemas.microsoft.com/office/drawing/2016/5/10/chartex" xmlns:cx5="http://schemas.microsoft.com/office/drawing/2016/5/11/chartex" xmlns:cx6="http://schemas.microsoft.com/office/drawing/2016/5/12/chartex" xmlns:cx7="http://schemas.microsoft.com/office/drawing/2016/5/13/chartex" xmlns:cx8="http://schemas.microsoft.com/office/drawing/2016/5/14/chartex" xmlns:mc="http://schemas.openxmlformats.org/markup-compatibility/2006" xmlns:aink="http://schemas.microsoft.com/office/drawing/2016/ink" xmlns:am3d="http://schemas.microsoft.com/office/drawing/2017/model3d" xmlns:o="urn:schemas-microsoft-com:office:office" xmlns:oel="http://schemas.microsoft.com/office/2019/extlst" xmlns:r="http://schemas.openxmlformats.org/officeDocument/2006/relationships" xmlns:m="http://schemas.openxmlformats.org/officeDocument/2006/math" xmlns:v="urn:schemas-microsoft-com:vml" xmlns:wp14="http://schemas.microsoft.com/office/word/2010/wordprocessingDrawing" xmlns:wp="http://schemas.openxmlformats.org/drawingml/2006/wordprocessingDrawing" xmlns:w10="urn:schemas-microsoft-com:office:word" xmlns:w="http://schemas.openxmlformats.org/wordprocessingml/2006/main" xmlns:w14="http://schemas.microsoft.com/office/word/2010/wordml" xmlns:w15="http://schemas.microsoft.com/office/word/2012/wordml" xmlns:w16cei="http://schemas.microsoft.com/office/word/2026/wordml/cei" xmlns:w16cex="http://schemas.microsoft.com/office/word/2018/wordml/cex" xmlns:w16cid="http://schemas.microsoft.com/office/word/2016/wordml/cid" xmlns:w16="http://schemas.microsoft.com/office/word/2018/wordml" xmlns:w16du="http://schemas.microsoft.com/office/word/2023/wordml/word16du" xmlns:w16sdtdh="http://schemas.microsoft.com/office/word/2020/wordml/sdtdatahash" xmlns:w16sdtfl="http://schemas.microsoft.com/office/word/2024/wordml/sdtformatlock" xmlns:w16se="http://schemas.microsoft.com/office/word/2015/wordml/symex" xmlns:wpg="http://schemas.microsoft.com/office/word/2010/wordprocessingGroup" xmlns:wpi="http://schemas.microsoft.com/office/word/2010/wordprocessingInk" xmlns:wne="http://schemas.microsoft.com/office/word/2006/wordml" xmlns:wps="http://schemas.microsoft.com/office/word/2010/wordprocessingShape" mc:Ignorable="w14 w15 w16se w16cid w16 w16cex w16sdtdh w16sdtfl w16du wp14">
+<w:document xmlns:wpc="http://schemas.microsoft.com/office/word/2010/wordprocessingCanvas" xmlns:cx="http://schemas.microsoft.com/office/drawing/2014/chartex" xmlns:cx1="http://schemas.microsoft.com/office/drawing/2015/9/8/chartex" xmlns:cx2="http://schemas.microsoft.com/office/drawing/2015/10/21/chartex" xmlns:cx3="http://schemas.microsoft.com/office/drawing/2016/5/9/chartex" xmlns:cx4="http://schemas.microsoft.com/office/drawing/2016/5/10/chartex" xmlns:cx5="http://schemas.microsoft.com/office/drawing/2016/5/11/chartex" xmlns:cx6="http://schemas.microsoft.com/office/drawing/2016/5/12/chartex" xmlns:cx7="http://schemas.microsoft.com/office/drawing/2016/5/13/chartex" xmlns:cx8="http://schemas.microsoft.com/office/drawing/2016/5/14/chartex" xmlns:mc="http://schemas.openxmlformats.org/markup-compatibility/2006" xmlns:aink="http://schemas.microsoft.com/office/drawing/2016/ink" xmlns:am3d="http://schemas.microsoft.com/office/drawing/2017/model3d" xmlns:o="urn:schemas-microsoft-com:office:office" xmlns:oel="http://schemas.microsoft.com/office/2019/extlst" xmlns:r="http://schemas.openxmlformats.org/officeDocument/2006/relationships" xmlns:m="http://schemas.openxmlformats.org/officeDocument/2006/math" xmlns:v="urn:schemas-microsoft-com:vml" xmlns:wp14="http://schemas.microsoft.com/office/word/2010/wordprocessingDrawing" xmlns:wp="http://schemas.openxmlformats.org/drawingml/2006/wordprocessingDrawing" xmlns:w10="urn:schemas-microsoft-com:office:word" xmlns:w="http://schemas.openxmlformats.org/wordprocessingml/2006/main" xmlns:w14="http://schemas.microsoft.com/office/word/2010/wordml" xmlns:w15="http://schemas.microsoft.com/office/word/2012/wordml" xmlns:w16cex="http://schemas.microsoft.com/office/word/2018/wordml/cex" xmlns:w16cid="http://schemas.microsoft.com/office/word/2016/wordml/cid" xmlns:w16="http://schemas.microsoft.com/office/word/2018/wordml" xmlns:w16du="http://schemas.microsoft.com/office/word/2023/wordml/word16du" xmlns:w16sdtdh="http://schemas.microsoft.com/office/word/2020/wordml/sdtdatahash" xmlns:w16sdtfl="http://schemas.microsoft.com/office/word/2024/wordml/sdtformatlock" xmlns:w16se="http://schemas.microsoft.com/office/word/2015/wordml/symex" xmlns:wpg="http://schemas.microsoft.com/office/word/2010/wordprocessingGroup" xmlns:wpi="http://schemas.microsoft.com/office/word/2010/wordprocessingInk" xmlns:wne="http://schemas.microsoft.com/office/word/2006/wordml" xmlns:wps="http://schemas.microsoft.com/office/word/2010/wordprocessingShape" mc:Ignorable="w14 w15 w16se w16cid w16 w16cex w16sdtdh w16sdtfl w16du wp14">
   <w:body>
     <w:p>
       <w:r>
+        <w:rPr>
+          <w:noProof/>
+        </w:rPr>
         <w:drawing>
           <wp:inline distT="0" distB="0" distL="0" distR="0" wp14:anchorId="27720359" wp14:editId="432672DF">
             <wp:extent cx="5943600" cy="3342005"/>
@@ -71,6 +74,7 @@
       <w:r>
         <w:rPr>
           <w:rFonts w:cs="Cordia New"/>
+          <w:noProof/>
           <w:cs/>
         </w:rPr>
         <w:drawing>
@@ -114,6 +118,7 @@
       <w:r>
         <w:rPr>
           <w:rFonts w:cs="Cordia New"/>
+          <w:noProof/>
           <w:cs/>
         </w:rPr>
         <w:drawing>
@@ -155,12 +160,16 @@
     </w:p>
     <w:p>
       <w:r>
+        <w:rPr>
+          <w:rFonts w:cs="Cordia New"/>
+          <w:cs/>
+        </w:rPr>
         <w:lastRenderedPageBreak/>
         <w:drawing>
-          <wp:inline distT="0" distB="0" distL="0" distR="0" wp14:anchorId="73C1BD28" wp14:editId="61CF946D">
-            <wp:extent cx="5943600" cy="2967355"/>
-            <wp:effectExtent l="0" t="0" r="0" b="4445"/>
-            <wp:docPr id="1166003647" name="Picture 1"/>
+          <wp:inline distT="0" distB="0" distL="0" distR="0" wp14:anchorId="539DCD52" wp14:editId="6027BD9D">
+            <wp:extent cx="5943600" cy="2535555"/>
+            <wp:effectExtent l="0" t="0" r="0" b="0"/>
+            <wp:docPr id="1521482277" name="Picture 1"/>
             <wp:cNvGraphicFramePr>
               <a:graphicFrameLocks xmlns:a="http://schemas.openxmlformats.org/drawingml/2006/main" noChangeAspect="1"/>
             </wp:cNvGraphicFramePr>
@@ -168,7 +177,7 @@
               <a:graphicData uri="http://schemas.openxmlformats.org/drawingml/2006/picture">
                 <pic:pic xmlns:pic="http://schemas.openxmlformats.org/drawingml/2006/picture">
                   <pic:nvPicPr>
-                    <pic:cNvPr id="1166003647" name=""/>
+                    <pic:cNvPr id="1521482277" name=""/>
                     <pic:cNvPicPr/>
                   </pic:nvPicPr>
                   <pic:blipFill>
@@ -180,7 +189,7 @@
                   <pic:spPr>
                     <a:xfrm>
                       <a:off x="0" y="0"/>
-                      <a:ext cx="5943600" cy="2967355"/>
+                      <a:ext cx="5943600" cy="2535555"/>
                     </a:xfrm>
                     <a:prstGeom prst="rect">
                       <a:avLst/>
@@ -196,6 +205,479 @@
     <w:p>
       <w:r>
         <w:t xml:space="preserve">Part 2: Docker </w:t>
+      </w:r>
+      <w:r>
+        <w:br/>
+      </w:r>
+      <w:r>
+        <w:rPr>
+          <w:rFonts w:hint="cs"/>
+          <w:cs/>
+        </w:rPr>
+        <w:t xml:space="preserve">เกิดปัญหา เนื่องจาก </w:t>
+      </w:r>
+      <w:r>
+        <w:t xml:space="preserve">host pc </w:t>
+      </w:r>
+      <w:r>
+        <w:rPr>
+          <w:rFonts w:hint="cs"/>
+          <w:cs/>
+        </w:rPr>
+        <w:t xml:space="preserve">สามารถเปิดดู </w:t>
+      </w:r>
+      <w:r>
+        <w:t xml:space="preserve">metrics </w:t>
+      </w:r>
+      <w:r>
+        <w:rPr>
+          <w:rFonts w:hint="cs"/>
+          <w:cs/>
+        </w:rPr>
+        <w:t>ได้ผ่าน</w:t>
+      </w:r>
+      <w:r>
+        <w:t xml:space="preserve"> Web </w:t>
+      </w:r>
+      <w:r>
+        <w:rPr>
+          <w:rFonts w:hint="cs"/>
+          <w:cs/>
+        </w:rPr>
+        <w:t>แต่ว่า</w:t>
+      </w:r>
+      <w:r>
+        <w:t xml:space="preserve"> Prometheus </w:t>
+      </w:r>
+      <w:r>
+        <w:rPr>
+          <w:rFonts w:hint="cs"/>
+          <w:cs/>
+        </w:rPr>
+        <w:t xml:space="preserve">ไม่สามารถ </w:t>
+      </w:r>
+      <w:r>
+        <w:t xml:space="preserve">scrape </w:t>
+      </w:r>
+      <w:r>
+        <w:rPr>
+          <w:rFonts w:hint="cs"/>
+          <w:cs/>
+        </w:rPr>
+        <w:t xml:space="preserve">มาได้เลยทำการทำ </w:t>
+      </w:r>
+      <w:r>
+        <w:t>Tcpdumb</w:t>
+      </w:r>
+      <w:r>
+        <w:rPr>
+          <w:rFonts w:hint="cs"/>
+          <w:cs/>
+        </w:rPr>
+        <w:t xml:space="preserve"> ที่</w:t>
+      </w:r>
+      <w:r>
+        <w:t xml:space="preserve"> port 9100</w:t>
+      </w:r>
+      <w:r>
+        <w:rPr>
+          <w:rFonts w:hint="cs"/>
+          <w:cs/>
+        </w:rPr>
+        <w:t xml:space="preserve"> ของ</w:t>
+      </w:r>
+      <w:r>
+        <w:t xml:space="preserve"> node-exporter </w:t>
+      </w:r>
+      <w:r>
+        <w:rPr>
+          <w:rFonts w:hint="cs"/>
+          <w:cs/>
+        </w:rPr>
+        <w:t>บน</w:t>
+      </w:r>
+      <w:r>
+        <w:t xml:space="preserve"> rasberrypi</w:t>
+      </w:r>
+      <w:r>
+        <w:br/>
+      </w:r>
+      <w:r>
+        <w:rPr>
+          <w:noProof/>
+        </w:rPr>
+        <w:drawing>
+          <wp:inline distT="0" distB="0" distL="0" distR="0" wp14:anchorId="41D21239" wp14:editId="0BDC7399">
+            <wp:extent cx="5943600" cy="3421380"/>
+            <wp:effectExtent l="0" t="0" r="0" b="7620"/>
+            <wp:docPr id="973593058" name="Picture 1"/>
+            <wp:cNvGraphicFramePr>
+              <a:graphicFrameLocks xmlns:a="http://schemas.openxmlformats.org/drawingml/2006/main" noChangeAspect="1"/>
+            </wp:cNvGraphicFramePr>
+            <a:graphic xmlns:a="http://schemas.openxmlformats.org/drawingml/2006/main">
+              <a:graphicData uri="http://schemas.openxmlformats.org/drawingml/2006/picture">
+                <pic:pic xmlns:pic="http://schemas.openxmlformats.org/drawingml/2006/picture">
+                  <pic:nvPicPr>
+                    <pic:cNvPr id="973593058" name=""/>
+                    <pic:cNvPicPr/>
+                  </pic:nvPicPr>
+                  <pic:blipFill>
+                    <a:blip r:embed="rId8"/>
+                    <a:stretch>
+                      <a:fillRect/>
+                    </a:stretch>
+                  </pic:blipFill>
+                  <pic:spPr>
+                    <a:xfrm>
+                      <a:off x="0" y="0"/>
+                      <a:ext cx="5943600" cy="3421380"/>
+                    </a:xfrm>
+                    <a:prstGeom prst="rect">
+                      <a:avLst/>
+                    </a:prstGeom>
+                  </pic:spPr>
+                </pic:pic>
+              </a:graphicData>
+            </a:graphic>
+          </wp:inline>
+        </w:drawing>
+      </w:r>
+      <w:r>
+        <w:br/>
+      </w:r>
+      <w:r>
+        <w:rPr>
+          <w:rFonts w:hint="cs"/>
+          <w:cs/>
+        </w:rPr>
+        <w:t>จะเห็นว่า ไม่มีการ</w:t>
+      </w:r>
+      <w:r>
+        <w:rPr>
+          <w:rFonts w:hint="cs"/>
+          <w:cs/>
+        </w:rPr>
+        <w:t>ส่ง</w:t>
+      </w:r>
+      <w:r>
+        <w:t xml:space="preserve"> syn ack </w:t>
+      </w:r>
+      <w:r>
+        <w:rPr>
+          <w:rFonts w:hint="cs"/>
+          <w:cs/>
+        </w:rPr>
+        <w:t>หรือส่ง</w:t>
+      </w:r>
+      <w:r>
+        <w:t xml:space="preserve"> request http </w:t>
+      </w:r>
+      <w:r>
+        <w:rPr>
+          <w:rFonts w:hint="cs"/>
+          <w:cs/>
+        </w:rPr>
+        <w:t>เลยแม้จะ</w:t>
+      </w:r>
+      <w:r>
+        <w:t xml:space="preserve"> restart Prometheus </w:t>
+      </w:r>
+      <w:r>
+        <w:rPr>
+          <w:rFonts w:hint="cs"/>
+          <w:cs/>
+        </w:rPr>
+        <w:t>ก็ตาม เลยคิดว่า เลยคิดว่าปัญหาน่าจะเกิดจากการที่</w:t>
+      </w:r>
+      <w:r>
+        <w:t xml:space="preserve"> docker </w:t>
+      </w:r>
+      <w:r>
+        <w:rPr>
+          <w:rFonts w:hint="cs"/>
+          <w:cs/>
+        </w:rPr>
+        <w:t>เช็ค</w:t>
+      </w:r>
+      <w:r>
+        <w:t xml:space="preserve"> route table </w:t>
+      </w:r>
+      <w:r>
+        <w:rPr>
+          <w:rFonts w:hint="cs"/>
+          <w:cs/>
+        </w:rPr>
+        <w:t>แล้วคิดว่าเป็น</w:t>
+      </w:r>
+      <w:r>
+        <w:t xml:space="preserve"> ip </w:t>
+      </w:r>
+      <w:r>
+        <w:rPr>
+          <w:rFonts w:hint="cs"/>
+          <w:cs/>
+        </w:rPr>
+        <w:t>ใน</w:t>
+      </w:r>
+      <w:r>
+        <w:t xml:space="preserve"> docker </w:t>
+      </w:r>
+      <w:r>
+        <w:rPr>
+          <w:rFonts w:hint="cs"/>
+          <w:cs/>
+        </w:rPr>
+        <w:t>อีกทั้ง</w:t>
+      </w:r>
+      <w:r>
+        <w:t xml:space="preserve"> hostpot </w:t>
+      </w:r>
+      <w:r>
+        <w:rPr>
+          <w:rFonts w:hint="cs"/>
+          <w:cs/>
+        </w:rPr>
+        <w:t xml:space="preserve">ดันแจก </w:t>
+      </w:r>
+      <w:r>
+        <w:t xml:space="preserve">IP </w:t>
+      </w:r>
+      <w:r>
+        <w:rPr>
+          <w:rFonts w:hint="cs"/>
+          <w:cs/>
+        </w:rPr>
+        <w:t>เดียวกันกับที่</w:t>
+      </w:r>
+      <w:r>
+        <w:t xml:space="preserve"> docker </w:t>
+      </w:r>
+      <w:r>
+        <w:rPr>
+          <w:rFonts w:hint="cs"/>
+          <w:cs/>
+        </w:rPr>
+        <w:t>แจกด้วยทำให้ มันเกิดการสับสน ทำให้</w:t>
+      </w:r>
+      <w:r>
+        <w:t xml:space="preserve"> docker </w:t>
+      </w:r>
+      <w:r>
+        <w:rPr>
+          <w:rFonts w:hint="cs"/>
+          <w:cs/>
+        </w:rPr>
+        <w:t>เลยไม่ส่ง</w:t>
+      </w:r>
+      <w:r>
+        <w:t xml:space="preserve"> request</w:t>
+      </w:r>
+      <w:r>
+        <w:rPr>
+          <w:rFonts w:hint="cs"/>
+          <w:cs/>
+        </w:rPr>
+        <w:t xml:space="preserve"> </w:t>
+      </w:r>
+      <w:r>
+        <w:rPr>
+          <w:rFonts w:hint="cs"/>
+          <w:cs/>
+        </w:rPr>
+        <w:t>ออกมายัง</w:t>
+      </w:r>
+      <w:r>
+        <w:t xml:space="preserve"> default gateway </w:t>
+      </w:r>
+      <w:r>
+        <w:rPr>
+          <w:rFonts w:hint="cs"/>
+          <w:cs/>
+        </w:rPr>
+        <w:t>ทำให้</w:t>
+      </w:r>
+      <w:r>
+        <w:t xml:space="preserve"> request </w:t>
+      </w:r>
+      <w:r>
+        <w:rPr>
+          <w:rFonts w:hint="cs"/>
+          <w:cs/>
+        </w:rPr>
+        <w:t>มาไม่ถึง</w:t>
+      </w:r>
+      <w:r>
+        <w:rPr>
+          <w:cs/>
+        </w:rPr>
+        <w:br/>
+      </w:r>
+      <w:r>
+        <w:rPr>
+          <w:rFonts w:hint="cs"/>
+          <w:cs/>
+        </w:rPr>
+        <w:lastRenderedPageBreak/>
+        <w:t>เลยทำการแก้ไขการแจก</w:t>
+      </w:r>
+      <w:r>
+        <w:t xml:space="preserve"> IP </w:t>
+      </w:r>
+      <w:r>
+        <w:rPr>
+          <w:rFonts w:hint="cs"/>
+          <w:cs/>
+        </w:rPr>
+        <w:t>ของ</w:t>
+      </w:r>
+      <w:r>
+        <w:t xml:space="preserve"> docker </w:t>
+      </w:r>
+      <w:r>
+        <w:rPr>
+          <w:rFonts w:hint="cs"/>
+          <w:cs/>
+        </w:rPr>
+        <w:t>ที่</w:t>
+      </w:r>
+      <w:r>
+        <w:t xml:space="preserve"> docker engine </w:t>
+      </w:r>
+      <w:r>
+        <w:rPr>
+          <w:rFonts w:hint="cs"/>
+          <w:cs/>
+        </w:rPr>
+        <w:t xml:space="preserve">โดยกำหนดให้ แจก </w:t>
+      </w:r>
+      <w:r>
+        <w:t xml:space="preserve">private IP </w:t>
+      </w:r>
+      <w:r>
+        <w:br/>
+      </w:r>
+      <w:r>
+        <w:rPr>
+          <w:noProof/>
+        </w:rPr>
+        <w:drawing>
+          <wp:inline distT="0" distB="0" distL="0" distR="0" wp14:anchorId="7F1C6FB1" wp14:editId="0736A2E9">
+            <wp:extent cx="5943600" cy="3339465"/>
+            <wp:effectExtent l="0" t="0" r="0" b="0"/>
+            <wp:docPr id="2110667832" name="Picture 1"/>
+            <wp:cNvGraphicFramePr>
+              <a:graphicFrameLocks xmlns:a="http://schemas.openxmlformats.org/drawingml/2006/main" noChangeAspect="1"/>
+            </wp:cNvGraphicFramePr>
+            <a:graphic xmlns:a="http://schemas.openxmlformats.org/drawingml/2006/main">
+              <a:graphicData uri="http://schemas.openxmlformats.org/drawingml/2006/picture">
+                <pic:pic xmlns:pic="http://schemas.openxmlformats.org/drawingml/2006/picture">
+                  <pic:nvPicPr>
+                    <pic:cNvPr id="2110667832" name=""/>
+                    <pic:cNvPicPr/>
+                  </pic:nvPicPr>
+                  <pic:blipFill>
+                    <a:blip r:embed="rId9"/>
+                    <a:stretch>
+                      <a:fillRect/>
+                    </a:stretch>
+                  </pic:blipFill>
+                  <pic:spPr>
+                    <a:xfrm>
+                      <a:off x="0" y="0"/>
+                      <a:ext cx="5943600" cy="3339465"/>
+                    </a:xfrm>
+                    <a:prstGeom prst="rect">
+                      <a:avLst/>
+                    </a:prstGeom>
+                  </pic:spPr>
+                </pic:pic>
+              </a:graphicData>
+            </a:graphic>
+          </wp:inline>
+        </w:drawing>
+      </w:r>
+      <w:r>
+        <w:br/>
+      </w:r>
+      <w:r>
+        <w:rPr>
+          <w:rFonts w:hint="cs"/>
+          <w:cs/>
+        </w:rPr>
+        <w:t>จากนั้น</w:t>
+      </w:r>
+      <w:r>
+        <w:t xml:space="preserve"> docker compose up -d </w:t>
+      </w:r>
+      <w:r>
+        <w:rPr>
+          <w:rFonts w:hint="cs"/>
+          <w:cs/>
+        </w:rPr>
+        <w:t>ใหม่ก็จะขึ้น</w:t>
+      </w:r>
+      <w:r>
+        <w:t xml:space="preserve"> node-exporter-2 </w:t>
+      </w:r>
+      <w:r>
+        <w:rPr>
+          <w:rFonts w:hint="cs"/>
+          <w:cs/>
+        </w:rPr>
+        <w:t>บน</w:t>
+      </w:r>
+      <w:r>
+        <w:t xml:space="preserve"> raspberrypi</w:t>
+      </w:r>
+      <w:r>
+        <w:rPr>
+          <w:rFonts w:hint="cs"/>
+          <w:cs/>
+        </w:rPr>
+        <w:t xml:space="preserve"> เรียบร้อย</w:t>
+      </w:r>
+      <w:r>
+        <w:br/>
+      </w:r>
+      <w:r>
+        <w:rPr>
+          <w:noProof/>
+        </w:rPr>
+        <w:drawing>
+          <wp:inline distT="0" distB="0" distL="0" distR="0" wp14:anchorId="14DA7EFA" wp14:editId="1CF43E9A">
+            <wp:extent cx="5943600" cy="3365500"/>
+            <wp:effectExtent l="0" t="0" r="0" b="6350"/>
+            <wp:docPr id="2124829411" name="Picture 1"/>
+            <wp:cNvGraphicFramePr>
+              <a:graphicFrameLocks xmlns:a="http://schemas.openxmlformats.org/drawingml/2006/main" noChangeAspect="1"/>
+            </wp:cNvGraphicFramePr>
+            <a:graphic xmlns:a="http://schemas.openxmlformats.org/drawingml/2006/main">
+              <a:graphicData uri="http://schemas.openxmlformats.org/drawingml/2006/picture">
+                <pic:pic xmlns:pic="http://schemas.openxmlformats.org/drawingml/2006/picture">
+                  <pic:nvPicPr>
+                    <pic:cNvPr id="2124829411" name=""/>
+                    <pic:cNvPicPr/>
+                  </pic:nvPicPr>
+                  <pic:blipFill>
+                    <a:blip r:embed="rId10"/>
+                    <a:stretch>
+                      <a:fillRect/>
+                    </a:stretch>
+                  </pic:blipFill>
+                  <pic:spPr>
+                    <a:xfrm>
+                      <a:off x="0" y="0"/>
+                      <a:ext cx="5943600" cy="3365500"/>
+                    </a:xfrm>
+                    <a:prstGeom prst="rect">
+                      <a:avLst/>
+                    </a:prstGeom>
+                  </pic:spPr>
+                </pic:pic>
+              </a:graphicData>
+            </a:graphic>
+          </wp:inline>
+        </w:drawing>
       </w:r>
     </w:p>
     <w:sectPr>

</xml_diff>